<commit_message>
Dark-theme PDF version of the Opsatnic hiring one-pager
Author the one-pager as a dark HTML sheet and render it to PDF with the
background printed, so the PDF matches the on-screen dark look (Word dark
mode is screen-only). Fold in the Duke (procurement + EOC 5-year pursuit/MSA)
and PG&E (short-term self-perform) wording revisions in both versions.
</commit_message>
<xml_diff>
--- a/hiring/CVR_Hire_OnePager_Opsatnic.docx
+++ b/hiring/CVR_Hire_OnePager_Opsatnic.docx
@@ -455,7 +455,7 @@
                 <w:sz w:val="17"/>
                 <w:szCs w:val="17"/>
               </w:rPr>
-              <w:t xml:space="preserve">Strong relationship with the Director of Transmission Asset Management.</w:t>
+              <w:t xml:space="preserve">Strong relationship with the Director of Transmission Asset Management and procurement. John led the recent EOC 5-year pursuit / MSA.</w:t>
             </w:r>
           </w:p>
         </w:tc>
@@ -631,7 +631,7 @@
                 <w:sz w:val="17"/>
                 <w:szCs w:val="17"/>
               </w:rPr>
-              <w:t xml:space="preserve">VP-level relationships. Pursue pure engineering or EPCM / engineering mix — no self-perform construction exposure.</w:t>
+              <w:t xml:space="preserve">VP-level relationships. Pursue pure engineering or EPCM / engineering mix — no short-term self-perform construction exposure.</w:t>
             </w:r>
           </w:p>
         </w:tc>

</xml_diff>